<commit_message>
Prueba nivel 3 y actualización de documentación
</commit_message>
<xml_diff>
--- a/m5core2/documents/codigos.docx
+++ b/m5core2/documents/codigos.docx
@@ -101,7 +101,7 @@
           <w:noProof/>
         </w:rPr>
         <w:drawing>
-          <wp:inline distT="0" distB="0" distL="0" distR="0" wp14:anchorId="2B98C831" wp14:editId="75EC9DE3">
+          <wp:inline distT="0" distB="0" distL="0" distR="0" wp14:anchorId="2B98C831" wp14:editId="75C404D0">
             <wp:extent cx="1800000" cy="1804401"/>
             <wp:effectExtent l="0" t="0" r="0" b="5715"/>
             <wp:docPr id="412969776" name="Imagen 3" descr="Imagen que contiene Código QR&#10;&#10;El contenido generado por IA puede ser incorrecto."/>
@@ -316,9 +316,12 @@
         <w:jc w:val="center"/>
       </w:pPr>
       <w:r>
+        <w:rPr>
+          <w:noProof/>
+        </w:rPr>
         <w:lastRenderedPageBreak/>
         <w:drawing>
-          <wp:inline distT="0" distB="0" distL="0" distR="0" wp14:anchorId="05F704FE" wp14:editId="3D4407D0">
+          <wp:inline distT="0" distB="0" distL="0" distR="0" wp14:anchorId="05F704FE" wp14:editId="347E8BC0">
             <wp:extent cx="1800000" cy="1820769"/>
             <wp:effectExtent l="0" t="0" r="0" b="8255"/>
             <wp:docPr id="2112709103" name="Imagen 4" descr="Imagen que contiene Texto&#10;&#10;El contenido generado por IA puede ser incorrecto."/>
@@ -391,6 +394,9 @@
     </w:p>
     <w:p>
       <w:r>
+        <w:rPr>
+          <w:noProof/>
+        </w:rPr>
         <w:drawing>
           <wp:inline distT="0" distB="0" distL="0" distR="0" wp14:anchorId="5BA25384" wp14:editId="1708F25A">
             <wp:extent cx="5400040" cy="539750"/>
@@ -433,8 +439,11 @@
         <w:jc w:val="center"/>
       </w:pPr>
       <w:r>
+        <w:rPr>
+          <w:noProof/>
+        </w:rPr>
         <w:drawing>
-          <wp:inline distT="0" distB="0" distL="0" distR="0" wp14:anchorId="0E64E93A" wp14:editId="36B0F216">
+          <wp:inline distT="0" distB="0" distL="0" distR="0" wp14:anchorId="0E64E93A" wp14:editId="7E844CAD">
             <wp:extent cx="1800000" cy="1817408"/>
             <wp:effectExtent l="0" t="0" r="0" b="0"/>
             <wp:docPr id="1247964849" name="Imagen 2" descr="Texto&#10;&#10;El contenido generado por IA puede ser incorrecto."/>
@@ -505,7 +514,19 @@
       </w:r>
       <w:proofErr w:type="spellEnd"/>
       <w:r>
-        <w:t xml:space="preserve"> que envía mensajes UDP al M5Stack cada vez que se hace una búsqueda en Google:</w:t>
+        <w:t xml:space="preserve"> </w:t>
+      </w:r>
+      <w:r>
+        <w:t>(</w:t>
+      </w:r>
+      <w:r>
+        <w:t>flujosudp</w:t>
+      </w:r>
+      <w:r>
+        <w:t xml:space="preserve">.py) </w:t>
+      </w:r>
+      <w:r>
+        <w:t>que envía mensajes UDP al M5Stack cada vez que se hace una búsqueda en Google:</w:t>
       </w:r>
     </w:p>
     <w:p>
@@ -518,7 +539,7 @@
           <w:noProof/>
         </w:rPr>
         <w:drawing>
-          <wp:inline distT="0" distB="0" distL="0" distR="0" wp14:anchorId="0389EFCB" wp14:editId="1FAC792A">
+          <wp:inline distT="0" distB="0" distL="0" distR="0" wp14:anchorId="0389EFCB" wp14:editId="5E2CFA1E">
             <wp:extent cx="1800000" cy="1806729"/>
             <wp:effectExtent l="0" t="0" r="0" b="3175"/>
             <wp:docPr id="1269582860" name="Imagen 5" descr="Interfaz de usuario gráfica&#10;&#10;El contenido generado por IA puede ser incorrecto."/>
@@ -572,6 +593,99 @@
         </w:drawing>
       </w:r>
     </w:p>
+    <w:p>
+      <w:pPr>
+        <w:pStyle w:val="Ttulo2"/>
+        <w:rPr>
+          <w:i/>
+          <w:iCs/>
+          <w:color w:val="000000" w:themeColor="text1"/>
+        </w:rPr>
+      </w:pPr>
+      <w:r>
+        <w:rPr>
+          <w:i/>
+          <w:iCs/>
+          <w:color w:val="000000" w:themeColor="text1"/>
+        </w:rPr>
+        <w:t>nivel3udp.cpp</w:t>
+      </w:r>
+    </w:p>
+    <w:p>
+      <w:r>
+        <w:t>El M5Stack se conecta a la red y se ejecuta un .</w:t>
+      </w:r>
+      <w:proofErr w:type="spellStart"/>
+      <w:r>
+        <w:t>py</w:t>
+      </w:r>
+      <w:proofErr w:type="spellEnd"/>
+      <w:r>
+        <w:t xml:space="preserve"> (flujosudp1.py) que envía los mensajes UDP con más nivel de detalle:</w:t>
+      </w:r>
+    </w:p>
+    <w:p>
+      <w:pPr>
+        <w:jc w:val="center"/>
+      </w:pPr>
+      <w:r>
+        <w:lastRenderedPageBreak/>
+        <w:drawing>
+          <wp:inline distT="0" distB="0" distL="0" distR="0" wp14:anchorId="255CF3E3" wp14:editId="0F161B96">
+            <wp:extent cx="1800000" cy="1684079"/>
+            <wp:effectExtent l="0" t="0" r="0" b="0"/>
+            <wp:docPr id="1067415455" name="Imagen 2" descr="Interfaz de usuario gráfica&#10;&#10;El contenido generado por IA puede ser incorrecto."/>
+            <wp:cNvGraphicFramePr>
+              <a:graphicFrameLocks xmlns:a="http://schemas.openxmlformats.org/drawingml/2006/main" noChangeAspect="1"/>
+            </wp:cNvGraphicFramePr>
+            <a:graphic xmlns:a="http://schemas.openxmlformats.org/drawingml/2006/main">
+              <a:graphicData uri="http://schemas.openxmlformats.org/drawingml/2006/picture">
+                <pic:pic xmlns:pic="http://schemas.openxmlformats.org/drawingml/2006/picture">
+                  <pic:nvPicPr>
+                    <pic:cNvPr id="1067415455" name="Imagen 2" descr="Interfaz de usuario gráfica&#10;&#10;El contenido generado por IA puede ser incorrecto."/>
+                    <pic:cNvPicPr>
+                      <a:picLocks noChangeAspect="1" noChangeArrowheads="1"/>
+                    </pic:cNvPicPr>
+                  </pic:nvPicPr>
+                  <pic:blipFill rotWithShape="1">
+                    <a:blip r:embed="rId14" cstate="print">
+                      <a:extLst>
+                        <a:ext uri="{28A0092B-C50C-407E-A947-70E740481C1C}">
+                          <a14:useLocalDpi xmlns:a14="http://schemas.microsoft.com/office/drawing/2010/main" val="0"/>
+                        </a:ext>
+                      </a:extLst>
+                    </a:blip>
+                    <a:srcRect l="17874" t="25928" r="16392" b="27948"/>
+                    <a:stretch>
+                      <a:fillRect/>
+                    </a:stretch>
+                  </pic:blipFill>
+                  <pic:spPr bwMode="auto">
+                    <a:xfrm>
+                      <a:off x="0" y="0"/>
+                      <a:ext cx="1800000" cy="1684079"/>
+                    </a:xfrm>
+                    <a:prstGeom prst="rect">
+                      <a:avLst/>
+                    </a:prstGeom>
+                    <a:noFill/>
+                    <a:ln>
+                      <a:noFill/>
+                    </a:ln>
+                    <a:extLst>
+                      <a:ext uri="{53640926-AAD7-44D8-BBD7-CCE9431645EC}">
+                        <a14:shadowObscured xmlns:a14="http://schemas.microsoft.com/office/drawing/2010/main"/>
+                      </a:ext>
+                    </a:extLst>
+                  </pic:spPr>
+                </pic:pic>
+              </a:graphicData>
+            </a:graphic>
+          </wp:inline>
+        </w:drawing>
+      </w:r>
+    </w:p>
+    <w:p/>
     <w:sectPr>
       <w:pgSz w:w="11906" w:h="16838"/>
       <w:pgMar w:top="1417" w:right="1701" w:bottom="1417" w:left="1701" w:header="708" w:footer="708" w:gutter="0"/>

</xml_diff>

<commit_message>
Captura con estadísticas automática y con botones del dispositivo
</commit_message>
<xml_diff>
--- a/m5core2/documents/codigos.docx
+++ b/m5core2/documents/codigos.docx
@@ -45,15 +45,7 @@
         <w:jc w:val="both"/>
       </w:pPr>
       <w:r>
-        <w:t>Implementa un contador de milisegundos. El botón B (el central) sirve para parar/</w:t>
-      </w:r>
-      <w:proofErr w:type="spellStart"/>
-      <w:r>
-        <w:t>rearrancar</w:t>
-      </w:r>
-      <w:proofErr w:type="spellEnd"/>
-      <w:r>
-        <w:t xml:space="preserve"> el contador.</w:t>
+        <w:t>Implementa un contador de milisegundos. El botón B (el central) sirve para parar/rearrancar el contador.</w:t>
       </w:r>
     </w:p>
     <w:p>
@@ -81,15 +73,7 @@
     </w:p>
     <w:p>
       <w:r>
-        <w:t xml:space="preserve">El M5Stack se conecta a una red </w:t>
-      </w:r>
-      <w:proofErr w:type="spellStart"/>
-      <w:r>
-        <w:t>WiFi</w:t>
-      </w:r>
-      <w:proofErr w:type="spellEnd"/>
-      <w:r>
-        <w:t xml:space="preserve"> (mi móvil) y se muestra por pantalla:</w:t>
+        <w:t>El M5Stack se conecta a una red WiFi (mi móvil) y se muestra por pantalla:</w:t>
       </w:r>
     </w:p>
     <w:p>
@@ -101,7 +85,7 @@
           <w:noProof/>
         </w:rPr>
         <w:drawing>
-          <wp:inline distT="0" distB="0" distL="0" distR="0" wp14:anchorId="2B98C831" wp14:editId="75C404D0">
+          <wp:inline distT="0" distB="0" distL="0" distR="0" wp14:anchorId="2B98C831" wp14:editId="716483C9">
             <wp:extent cx="1800000" cy="1804401"/>
             <wp:effectExtent l="0" t="0" r="0" b="5715"/>
             <wp:docPr id="412969776" name="Imagen 3" descr="Imagen que contiene Código QR&#10;&#10;El contenido generado por IA puede ser incorrecto."/>
@@ -300,15 +284,7 @@
     </w:p>
     <w:p>
       <w:r>
-        <w:t xml:space="preserve">El M5Stack se conecta a una red </w:t>
-      </w:r>
-      <w:proofErr w:type="spellStart"/>
-      <w:r>
-        <w:t>WiFi</w:t>
-      </w:r>
-      <w:proofErr w:type="spellEnd"/>
-      <w:r>
-        <w:t xml:space="preserve"> (mi móvil) y se muestra por pantalla:</w:t>
+        <w:t>El M5Stack se conecta a una red WiFi (mi móvil) y se muestra por pantalla:</w:t>
       </w:r>
     </w:p>
     <w:p>
@@ -321,7 +297,7 @@
         </w:rPr>
         <w:lastRenderedPageBreak/>
         <w:drawing>
-          <wp:inline distT="0" distB="0" distL="0" distR="0" wp14:anchorId="05F704FE" wp14:editId="347E8BC0">
+          <wp:inline distT="0" distB="0" distL="0" distR="0" wp14:anchorId="05F704FE" wp14:editId="6095E44F">
             <wp:extent cx="1800000" cy="1820769"/>
             <wp:effectExtent l="0" t="0" r="0" b="8255"/>
             <wp:docPr id="2112709103" name="Imagen 4" descr="Imagen que contiene Texto&#10;&#10;El contenido generado por IA puede ser incorrecto."/>
@@ -443,7 +419,7 @@
           <w:noProof/>
         </w:rPr>
         <w:drawing>
-          <wp:inline distT="0" distB="0" distL="0" distR="0" wp14:anchorId="0E64E93A" wp14:editId="7E844CAD">
+          <wp:inline distT="0" distB="0" distL="0" distR="0" wp14:anchorId="0E64E93A" wp14:editId="6BB6D853">
             <wp:extent cx="1800000" cy="1817408"/>
             <wp:effectExtent l="0" t="0" r="0" b="0"/>
             <wp:docPr id="1247964849" name="Imagen 2" descr="Texto&#10;&#10;El contenido generado por IA puede ser incorrecto."/>
@@ -506,15 +482,7 @@
         </w:numPr>
       </w:pPr>
       <w:r>
-        <w:t>Se ejecuta un .</w:t>
-      </w:r>
-      <w:proofErr w:type="spellStart"/>
-      <w:r>
-        <w:t>py</w:t>
-      </w:r>
-      <w:proofErr w:type="spellEnd"/>
-      <w:r>
-        <w:t xml:space="preserve"> </w:t>
+        <w:t xml:space="preserve">Se ejecuta un .py </w:t>
       </w:r>
       <w:r>
         <w:t>(</w:t>
@@ -539,7 +507,7 @@
           <w:noProof/>
         </w:rPr>
         <w:drawing>
-          <wp:inline distT="0" distB="0" distL="0" distR="0" wp14:anchorId="0389EFCB" wp14:editId="5E2CFA1E">
+          <wp:inline distT="0" distB="0" distL="0" distR="0" wp14:anchorId="0389EFCB" wp14:editId="344239F9">
             <wp:extent cx="1800000" cy="1806729"/>
             <wp:effectExtent l="0" t="0" r="0" b="3175"/>
             <wp:docPr id="1269582860" name="Imagen 5" descr="Interfaz de usuario gráfica&#10;&#10;El contenido generado por IA puede ser incorrecto."/>
@@ -613,15 +581,7 @@
     </w:p>
     <w:p>
       <w:r>
-        <w:t>El M5Stack se conecta a la red y se ejecuta un .</w:t>
-      </w:r>
-      <w:proofErr w:type="spellStart"/>
-      <w:r>
-        <w:t>py</w:t>
-      </w:r>
-      <w:proofErr w:type="spellEnd"/>
-      <w:r>
-        <w:t xml:space="preserve"> (flujosudp1.py) que envía los mensajes UDP con más nivel de detalle:</w:t>
+        <w:t>El M5Stack se conecta a la red y se ejecuta un .py (flujosudp1.py) que envía los mensajes UDP con más nivel de detalle:</w:t>
       </w:r>
     </w:p>
     <w:p>
@@ -629,6 +589,9 @@
         <w:jc w:val="center"/>
       </w:pPr>
       <w:r>
+        <w:rPr>
+          <w:noProof/>
+        </w:rPr>
         <w:lastRenderedPageBreak/>
         <w:drawing>
           <wp:inline distT="0" distB="0" distL="0" distR="0" wp14:anchorId="255CF3E3" wp14:editId="0F161B96">
@@ -685,7 +648,167 @@
         </w:drawing>
       </w:r>
     </w:p>
-    <w:p/>
+    <w:p>
+      <w:pPr>
+        <w:pStyle w:val="Ttulo2"/>
+        <w:rPr>
+          <w:i/>
+          <w:iCs/>
+          <w:color w:val="000000" w:themeColor="text1"/>
+        </w:rPr>
+      </w:pPr>
+      <w:r>
+        <w:rPr>
+          <w:i/>
+          <w:iCs/>
+          <w:color w:val="000000" w:themeColor="text1"/>
+        </w:rPr>
+        <w:t>nivel4udp.cpp</w:t>
+      </w:r>
+    </w:p>
+    <w:p>
+      <w:r>
+        <w:t>Captura tráfico durante 1 minuto y muestra las estadísticas de esos flujos durante 10 segundos.</w:t>
+      </w:r>
+    </w:p>
+    <w:p>
+      <w:pPr>
+        <w:pStyle w:val="Ttulo2"/>
+        <w:rPr>
+          <w:i/>
+          <w:iCs/>
+          <w:color w:val="000000" w:themeColor="text1"/>
+        </w:rPr>
+      </w:pPr>
+      <w:r>
+        <w:rPr>
+          <w:i/>
+          <w:iCs/>
+          <w:color w:val="000000" w:themeColor="text1"/>
+        </w:rPr>
+        <w:t>nivel4udp</w:t>
+      </w:r>
+      <w:r>
+        <w:rPr>
+          <w:i/>
+          <w:iCs/>
+          <w:color w:val="000000" w:themeColor="text1"/>
+        </w:rPr>
+        <w:t>v1</w:t>
+      </w:r>
+      <w:r>
+        <w:rPr>
+          <w:i/>
+          <w:iCs/>
+          <w:color w:val="000000" w:themeColor="text1"/>
+        </w:rPr>
+        <w:t>.cpp</w:t>
+      </w:r>
+    </w:p>
+    <w:p>
+      <w:r>
+        <w:t>Uso de botones:</w:t>
+      </w:r>
+    </w:p>
+    <w:p>
+      <w:pPr>
+        <w:pStyle w:val="Prrafodelista"/>
+        <w:numPr>
+          <w:ilvl w:val="0"/>
+          <w:numId w:val="1"/>
+        </w:numPr>
+      </w:pPr>
+      <w:r>
+        <w:t>El botón A comienza la captura</w:t>
+      </w:r>
+    </w:p>
+    <w:p>
+      <w:pPr>
+        <w:pStyle w:val="Prrafodelista"/>
+        <w:numPr>
+          <w:ilvl w:val="0"/>
+          <w:numId w:val="1"/>
+        </w:numPr>
+      </w:pPr>
+      <w:r>
+        <w:t>El botón C para la captura y muestra las estadísticas de los flujos capturados</w:t>
+      </w:r>
+    </w:p>
+    <w:p>
+      <w:pPr>
+        <w:pStyle w:val="Ttulo2"/>
+        <w:rPr>
+          <w:i/>
+          <w:iCs/>
+          <w:color w:val="000000" w:themeColor="text1"/>
+        </w:rPr>
+      </w:pPr>
+      <w:r>
+        <w:rPr>
+          <w:i/>
+          <w:iCs/>
+          <w:color w:val="000000" w:themeColor="text1"/>
+        </w:rPr>
+        <w:t>nivel4udp</w:t>
+      </w:r>
+      <w:r>
+        <w:rPr>
+          <w:i/>
+          <w:iCs/>
+          <w:color w:val="000000" w:themeColor="text1"/>
+        </w:rPr>
+        <w:t>v2</w:t>
+      </w:r>
+      <w:r>
+        <w:rPr>
+          <w:i/>
+          <w:iCs/>
+          <w:color w:val="000000" w:themeColor="text1"/>
+        </w:rPr>
+        <w:t>.cpp</w:t>
+      </w:r>
+    </w:p>
+    <w:p>
+      <w:r>
+        <w:t>Uso de botones:</w:t>
+      </w:r>
+    </w:p>
+    <w:p>
+      <w:pPr>
+        <w:pStyle w:val="Prrafodelista"/>
+        <w:numPr>
+          <w:ilvl w:val="0"/>
+          <w:numId w:val="1"/>
+        </w:numPr>
+      </w:pPr>
+      <w:r>
+        <w:t>El botón A comienza la captura</w:t>
+      </w:r>
+    </w:p>
+    <w:p>
+      <w:pPr>
+        <w:pStyle w:val="Prrafodelista"/>
+        <w:numPr>
+          <w:ilvl w:val="0"/>
+          <w:numId w:val="1"/>
+        </w:numPr>
+      </w:pPr>
+      <w:r>
+        <w:t>El botón C para la captura y muestra las estadísticas de los flujos capturados</w:t>
+      </w:r>
+    </w:p>
+    <w:p>
+      <w:pPr>
+        <w:pStyle w:val="Prrafodelista"/>
+        <w:numPr>
+          <w:ilvl w:val="0"/>
+          <w:numId w:val="1"/>
+        </w:numPr>
+      </w:pPr>
+      <w:r>
+        <w:t>El botón B pone el M5Stack en modo reposo: no captura ni muestra estadísticas.</w:t>
+      </w:r>
+    </w:p>
     <w:sectPr>
       <w:pgSz w:w="11906" w:h="16838"/>
       <w:pgMar w:top="1417" w:right="1701" w:bottom="1417" w:left="1701" w:header="708" w:footer="708" w:gutter="0"/>
@@ -1468,6 +1591,7 @@
   <w:style w:type="character" w:default="1" w:styleId="Fuentedeprrafopredeter">
     <w:name w:val="Default Paragraph Font"/>
     <w:uiPriority w:val="1"/>
+    <w:semiHidden/>
     <w:unhideWhenUsed/>
   </w:style>
   <w:style w:type="table" w:default="1" w:styleId="Tablanormal">

</xml_diff>